<commit_message>
Sprint 6: SEO-Rewrite Startseite + Keyword-Analyse [skip netlify]
- index.html: SEO-Fallback von 72 auf 426 Wörter ausgebaut, H1/Title auf "Kindergeburtstag planen kostenlos" aligned, 30+ interne Links
- _dev/docs/seo-keyword-analyse.xlsx: Vollständige Keyword-Analyse (SISTRIX, Seobility, PageSpeed, Konkurrenz)
- js/kindergeburtstag.js: Einladungskarten-CTA integriert
- SESSION-NOTES.md: Session-Dokumentation
- .claude/strategie-status.docx: Stand aktualisiert auf 02.04.2026

Co-Authored-By: Claude Opus 4.6 <noreply@anthropic.com>
</commit_message>
<xml_diff>
--- a/.claude/strategie-status.docx
+++ b/.claude/strategie-status.docx
@@ -35,7 +35,7 @@
         <w:spacing w:after="240"/>
       </w:pPr>
       <w:r>
-        <w:t xml:space="preserve">Stand: 27. März 2026 --- Internes Arbeitsdokument</w:t>
+        <w:t xml:space="preserve">Stand: 2. April 2026 --- Internes Arbeitsdokument</w:t>
       </w:r>
     </w:p>
     <w:p>
@@ -93,10 +93,10 @@
           <w:b/>
           <w:bCs/>
         </w:rPr>
-        <w:t xml:space="preserve">Stand 27.03.2026: </w:t>
-      </w:r>
-      <w:r>
-        <w:t xml:space="preserve">/schatzsuche Content-Relaunch mit 10-Block-Architektur ist LIVE (v12 deployed). 6 Motto-Seiten sind LIVE. 6 Schatzsuche-Unterseiten sind LIVE. Draft/Main-Branch-Workflow ist konfiguriert. Hero Engine MVP, Internal Linking Audit, Canonical Tags, Kaufmoment-Boxen + Affiliate-Links deployed (v13 + v14).</w:t>
+        <w:t xml:space="preserve">Stand 02.04.2026: </w:t>
+      </w:r>
+      <w:r>
+        <w:t xml:space="preserve">/schatzsuche Content-Relaunch mit 10-Block-Architektur ist LIVE (v12 deployed). 6 Motto-Seiten sind LIVE. 6 Schatzsuche-Unterseiten sind LIVE. Hero Engine MVP, Internal Linking Audit, Canonical Tags, Kaufmoment-Boxen + Affiliate-Links deployed (v13 + v14). SEO-Keyword-Analyse abgeschlossen. Startseite index.html von 72 auf 426 Wörter ausgebaut (Sprint 6 P0). Einladungskarten-CTA in kindergeburtstag.js integriert. GSC Sitemap re-submitted (336 URLs).</w:t>
       </w:r>
     </w:p>
     <w:p>
@@ -2345,6 +2345,75 @@
     </w:p>
     <w:p>
       <w:pPr>
+        <w:pStyle w:val="Heading2"/>
+      </w:pPr>
+      <w:r>
+        <w:t xml:space="preserve">2.12 SEO-Keyword-Analyse + Startseite-Rewrite (02.04.)</w:t>
+      </w:r>
+    </w:p>
+    <w:p>
+      <w:pPr>
+        <w:pStyle w:val="ListParagraph"/>
+        <w:numPr>
+          <w:ilvl w:val="0"/>
+          <w:numId w:val="2"/>
+        </w:numPr>
+      </w:pPr>
+      <w:r>
+        <w:t xml:space="preserve">Umfassende SEO-Keyword-Analyse: SISTRIX, Seobility, PageSpeed Insights, Konkurrenz-Vergleich (ausgefuxt.de, schnitzeljagd-ideen.de, kindergeburtstag-planen.de)</w:t>
+      </w:r>
+    </w:p>
+    <w:p>
+      <w:pPr>
+        <w:pStyle w:val="ListParagraph"/>
+        <w:numPr>
+          <w:ilvl w:val="0"/>
+          <w:numId w:val="2"/>
+        </w:numPr>
+      </w:pPr>
+      <w:r>
+        <w:t xml:space="preserve">Startseite index.html SEO-Fallback von 72 auf 426 Wörter ausgebaut: 7 Sektionen, 30+ interne Links, H1/Title-Alignment auf „Kindergeburtstag planen kostenlos“</w:t>
+      </w:r>
+    </w:p>
+    <w:p>
+      <w:pPr>
+        <w:pStyle w:val="ListParagraph"/>
+        <w:numPr>
+          <w:ilvl w:val="0"/>
+          <w:numId w:val="2"/>
+        </w:numPr>
+      </w:pPr>
+      <w:r>
+        <w:t xml:space="preserve">Einladungskarten-CTA in kindergeburtstag.js integriert (Link zu /einladung/erstellen)</w:t>
+      </w:r>
+    </w:p>
+    <w:p>
+      <w:pPr>
+        <w:pStyle w:val="ListParagraph"/>
+        <w:numPr>
+          <w:ilvl w:val="0"/>
+          <w:numId w:val="2"/>
+        </w:numPr>
+      </w:pPr>
+      <w:r>
+        <w:t xml:space="preserve">GSC Sitemap re-submitted (336 URLs, vorher 230)</w:t>
+      </w:r>
+    </w:p>
+    <w:p>
+      <w:pPr>
+        <w:pStyle w:val="ListParagraph"/>
+        <w:numPr>
+          <w:ilvl w:val="0"/>
+          <w:numId w:val="2"/>
+        </w:numPr>
+        <w:spacing w:after="240"/>
+      </w:pPr>
+      <w:r>
+        <w:t xml:space="preserve">SEO-Analyse-Dokument erstellt: _dev/docs/seo-keyword-analyse.xlsx (12 Keyword-Cluster, Konkurrenz-Matrix, Opportunities, 3-Phasen-Strategie)</w:t>
+      </w:r>
+    </w:p>
+    <w:p>
+      <w:pPr>
         <w:pStyle w:val="Heading1"/>
       </w:pPr>
       <w:r>
@@ -2788,7 +2857,7 @@
     </w:p>
     <w:p>
       <w:r>
-        <w:t xml:space="preserve">Dokument erstellt am 27. März 2026. Stand: v13 + v14 deployed. Hero Engine, Kill List, Internal Linking, Canonical Tags, Kaufmoment-Boxen LIVE.</w:t>
+        <w:t xml:space="preserve">Dokument erstellt am 27. März 2026, zuletzt aktualisiert am 2. April 2026. Stand: v14 deployed + Sprint 6 SEO-Rewrite. Startseite 426 Wörter, SEO-Analyse komplett, Einladungskarten-CTA integriert.</w:t>
       </w:r>
     </w:p>
     <w:sectPr>

</xml_diff>

<commit_message>
Strategie-Dokument: Premium-Feature-Roadmap ergänzt [skip netlify]
Neuer Abschnitt 7: Premium-Features (Roadmap)
- Rätsel nach Maß als höchste Prio mit Output-Formaten
- Kreuzworträtsel mit Lösungswort als Format innerhalb RnM
- Kreuzworträtsel-Generator auch standalone als Freebie/Lead-Magnet
- Weitere Premium- und Wachstums-Features aufgelistet
- Bisheriger Abschnitt 7 (Nächste Schritte) → 8

Co-Authored-By: Claude <noreply@anthropic.com>
</commit_message>
<xml_diff>
--- a/.claude/strategie-status.docx
+++ b/.claude/strategie-status.docx
@@ -35,7 +35,7 @@
         <w:spacing w:after="240"/>
       </w:pPr>
       <w:r>
-        <w:t xml:space="preserve">Stand: 2. April 2026 --- Internes Arbeitsdokument</w:t>
+        <w:t>Stand: 5. April 2026 --- Internes Arbeitsdokument</w:t>
       </w:r>
     </w:p>
     <w:p>
@@ -2788,10 +2788,142 @@
     </w:p>
     <w:p>
       <w:pPr>
+        <w:pStyle w:val="Heading 1"/>
+      </w:pPr>
+      <w:r>
+        <w:t xml:space="preserve">7. Premium-Features (Roadmap)</w:t>
+      </w:r>
+    </w:p>
+    <w:p>
+      <w:pPr>
+        <w:pStyle w:val="Heading 2"/>
+      </w:pPr>
+      <w:r>
+        <w:t xml:space="preserve">7.1 Rätsel nach Maß (Höchste Prio)</w:t>
+      </w:r>
+    </w:p>
+    <w:p>
+      <w:r>
+        <w:t xml:space="preserve">Eltern beschreiben ihren Ort (Garten/Wohnung, markante Punkte wie Apfelbaum/Sandkasten/Gartenhaus). Ein Claude API-Call generiert 5 Rätsel, die exakt zu diesem Ort passen. Kosten ~5ct, VK 2.99€. Macht die Schatzsuche von Template zu echtem personalisierten Erlebnis.</w:t>
+      </w:r>
+    </w:p>
+    <w:p>
+      <w:r>
+        <w:t xml:space="preserve"/>
+      </w:r>
+    </w:p>
+    <w:p>
+      <w:r>
+        <w:t xml:space="preserve">Output-Formate:</w:t>
+      </w:r>
+    </w:p>
+    <w:p>
+      <w:r>
+        <w:t xml:space="preserve">• Text-Rätsel: Klassische Rätsel als druckbare Stationskarten</w:t>
+      </w:r>
+    </w:p>
+    <w:p>
+      <w:r>
+        <w:t xml:space="preserve">• Kreuzworträtsel mit Lösungswort: Eltern geben Lösungswort vor (z.B. Kindername oder Motto-Wort). KI generiert passende Fragen + Antworten rund ums Kind/Ort/Motto. Generator baut daraus ein druckfertiges Schwedenrätsel, bei dem die markierte Spalte das Lösungswort ergibt. Komplett clientseitig (Grid-Algorithmus), KI liefert nur den Inhalt.</w:t>
+      </w:r>
+    </w:p>
+    <w:p>
+      <w:r>
+        <w:t xml:space="preserve">• Weitere Formate denkbar: Rebus, Bilderrätsel, Zahlencode</w:t>
+      </w:r>
+    </w:p>
+    <w:p>
+      <w:r>
+        <w:t xml:space="preserve"/>
+      </w:r>
+    </w:p>
+    <w:p>
+      <w:r>
+        <w:t xml:space="preserve">Kreuzworträtsel-Generator: Auch standalone als Freebie/Lead-Magnet nutzbar (Eltern geben eigene Fragen+Antworten ein, ohne KI). Premium-Upgrade = KI generiert die Inhalte automatisch.</w:t>
+      </w:r>
+    </w:p>
+    <w:p>
+      <w:pPr>
+        <w:pStyle w:val="Heading 2"/>
+      </w:pPr>
+      <w:r>
+        <w:t xml:space="preserve">7.2 Weitere Premium-Features (siehe Memory)</w:t>
+      </w:r>
+    </w:p>
+    <w:p>
+      <w:r>
+        <w:t xml:space="preserve">• KI-Spielmoderation (ElevenLabs Audio)</w:t>
+      </w:r>
+    </w:p>
+    <w:p>
+      <w:r>
+        <w:t xml:space="preserve">• Gute-Nacht-Geschichte (KI+Audio)</w:t>
+      </w:r>
+    </w:p>
+    <w:p>
+      <w:r>
+        <w:t xml:space="preserve">• Einladungs-Audio</w:t>
+      </w:r>
+    </w:p>
+    <w:p>
+      <w:r>
+        <w:t xml:space="preserve">• Eltern-Copilot</w:t>
+      </w:r>
+    </w:p>
+    <w:p>
+      <w:r>
+        <w:t xml:space="preserve">• Danke-Nachrichten</w:t>
+      </w:r>
+    </w:p>
+    <w:p>
+      <w:r>
+        <w:t xml:space="preserve">• Geburtstagssong</w:t>
+      </w:r>
+    </w:p>
+    <w:p>
+      <w:r>
+        <w:t xml:space="preserve">• Sofort-Schatzsuche Abo (2.99€/Monat)</w:t>
+      </w:r>
+    </w:p>
+    <w:p>
+      <w:pPr>
+        <w:pStyle w:val="Heading 2"/>
+      </w:pPr>
+      <w:r>
+        <w:t xml:space="preserve">7.3 Wachstums-Features</w:t>
+      </w:r>
+    </w:p>
+    <w:p>
+      <w:r>
+        <w:t xml:space="preserve">• WhatsApp-Partyseite (viraler Akquise-Kanal, 8 Leads pro Geburtstag)</w:t>
+      </w:r>
+    </w:p>
+    <w:p>
+      <w:r>
+        <w:t xml:space="preserve">• Wunschliste mit plattformübergreifendem Affiliate</w:t>
+      </w:r>
+    </w:p>
+    <w:p>
+      <w:r>
+        <w:t xml:space="preserve">• Klassen-Geburtstagskalender</w:t>
+      </w:r>
+    </w:p>
+    <w:p>
+      <w:r>
+        <w:t xml:space="preserve">• KI-Geschenkeberater</w:t>
+      </w:r>
+    </w:p>
+    <w:p>
+      <w:r>
+        <w:t xml:space="preserve">• Multiplayer-Schatzsuche (8-12 Jahre)</w:t>
+      </w:r>
+    </w:p>
+    <w:p>
+      <w:pPr>
         <w:pStyle w:val="Heading1"/>
       </w:pPr>
       <w:r>
-        <w:t xml:space="preserve">7. Nächste Schritte</w:t>
+        <w:t>8. Nächste Schritte</w:t>
       </w:r>
     </w:p>
     <w:p>
@@ -2857,7 +2989,7 @@
     </w:p>
     <w:p>
       <w:r>
-        <w:t xml:space="preserve">Dokument erstellt am 27. März 2026, zuletzt aktualisiert am 2. April 2026. Stand: v14 deployed + Sprint 6 SEO-Rewrite. Startseite 426 Wörter, SEO-Analyse komplett, Einladungskarten-CTA integriert.</w:t>
+        <w:t>Dokument erstellt am 27. März 2026, zuletzt aktualisiert am 5. April 2026. Stand: v14 deployed + Sprint 6 SEO-Rewrite + Premium-Feature-Roadmap. Startseite 426 Wörter, SEO-Analyse komplett, Einladungskarten-CTA integriert.</w:t>
       </w:r>
     </w:p>
     <w:sectPr>

</xml_diff>

<commit_message>
Strategie konsolidiert: Kreuzworträtsel + Wireframes + Docx-Update [skip netlify]
- Kreuzworträtsel als Output-Format unter Rätsel nach Maß ergänzt
  (auch standalone als Freebie/Lead-Magnet)
- Landingpage-Wireframes (Homepage, /kindergeburtstag, /schatzsuche)
  inkl. Kritik und Entscheidung dokumentiert
- strategie-status.docx Section 7 mit vollständiger Zusammenfassung
  aller Premium-Features, Revenue-Streams, Rankings, Projektionen
- Referenz auf premium-strategie-2026-04.md als Detail-Dokument

Co-Authored-By: Claude <noreply@anthropic.com>
</commit_message>
<xml_diff>
--- a/.claude/strategie-status.docx
+++ b/.claude/strategie-status.docx
@@ -2791,20 +2791,12 @@
         <w:pStyle w:val="Heading 1"/>
       </w:pPr>
       <w:r>
-        <w:t xml:space="preserve">7. Premium-Features (Roadmap)</w:t>
-      </w:r>
-    </w:p>
-    <w:p>
-      <w:pPr>
-        <w:pStyle w:val="Heading 2"/>
-      </w:pPr>
-      <w:r>
-        <w:t xml:space="preserve">7.1 Rätsel nach Maß (Höchste Prio)</w:t>
-      </w:r>
-    </w:p>
-    <w:p>
-      <w:r>
-        <w:t xml:space="preserve">Eltern beschreiben ihren Ort (Garten/Wohnung, markante Punkte wie Apfelbaum/Sandkasten/Gartenhaus). Ein Claude API-Call generiert 5 Rätsel, die exakt zu diesem Ort passen. Kosten ~5ct, VK 2.99€. Macht die Schatzsuche von Template zu echtem personalisierten Erlebnis.</w:t>
+        <w:t xml:space="preserve">7. Premium-Strategie &amp; Feature-Roadmap</w:t>
+      </w:r>
+    </w:p>
+    <w:p>
+      <w:r>
+        <w:t xml:space="preserve">Vollständige Dokumentation in: _dev/docs/premium-strategie-2026-04.md</w:t>
       </w:r>
     </w:p>
     <w:p>
@@ -2814,22 +2806,7 @@
     </w:p>
     <w:p>
       <w:r>
-        <w:t xml:space="preserve">Output-Formate:</w:t>
-      </w:r>
-    </w:p>
-    <w:p>
-      <w:r>
-        <w:t xml:space="preserve">• Text-Rätsel: Klassische Rätsel als druckbare Stationskarten</w:t>
-      </w:r>
-    </w:p>
-    <w:p>
-      <w:r>
-        <w:t xml:space="preserve">• Kreuzworträtsel mit Lösungswort: Eltern geben Lösungswort vor (z.B. Kindername oder Motto-Wort). KI generiert passende Fragen + Antworten rund ums Kind/Ort/Motto. Generator baut daraus ein druckfertiges Schwedenrätsel, bei dem die markierte Spalte das Lösungswort ergibt. Komplett clientseitig (Grid-Algorithmus), KI liefert nur den Inhalt.</w:t>
-      </w:r>
-    </w:p>
-    <w:p>
-      <w:r>
-        <w:t xml:space="preserve">• Weitere Formate denkbar: Rebus, Bilderrätsel, Zahlencode</w:t>
+        <w:t xml:space="preserve">Zusammenfassung:</w:t>
       </w:r>
     </w:p>
     <w:p>
@@ -2839,83 +2816,177 @@
     </w:p>
     <w:p>
       <w:r>
-        <w:t xml:space="preserve">Kreuzworträtsel-Generator: Auch standalone als Freebie/Lead-Magnet nutzbar (Eltern geben eigene Fragen+Antworten ein, ohne KI). Premium-Upgrade = KI generiert die Inhalte automatisch.</w:t>
-      </w:r>
-    </w:p>
-    <w:p>
-      <w:pPr>
-        <w:pStyle w:val="Heading 2"/>
-      </w:pPr>
-      <w:r>
-        <w:t xml:space="preserve">7.2 Weitere Premium-Features (siehe Memory)</w:t>
-      </w:r>
-    </w:p>
-    <w:p>
-      <w:r>
-        <w:t xml:space="preserve">• KI-Spielmoderation (ElevenLabs Audio)</w:t>
-      </w:r>
-    </w:p>
-    <w:p>
-      <w:r>
-        <w:t xml:space="preserve">• Gute-Nacht-Geschichte (KI+Audio)</w:t>
-      </w:r>
-    </w:p>
-    <w:p>
-      <w:r>
-        <w:t xml:space="preserve">• Einladungs-Audio</w:t>
-      </w:r>
-    </w:p>
-    <w:p>
-      <w:r>
-        <w:t xml:space="preserve">• Eltern-Copilot</w:t>
-      </w:r>
-    </w:p>
-    <w:p>
-      <w:r>
-        <w:t xml:space="preserve">• Danke-Nachrichten</w:t>
-      </w:r>
-    </w:p>
-    <w:p>
-      <w:r>
-        <w:t xml:space="preserve">• Geburtstagssong</w:t>
-      </w:r>
-    </w:p>
-    <w:p>
-      <w:r>
-        <w:t xml:space="preserve">• Sofort-Schatzsuche Abo (2.99€/Monat)</w:t>
-      </w:r>
-    </w:p>
-    <w:p>
-      <w:pPr>
-        <w:pStyle w:val="Heading 2"/>
-      </w:pPr>
-      <w:r>
-        <w:t xml:space="preserve">7.3 Wachstums-Features</w:t>
-      </w:r>
-    </w:p>
-    <w:p>
-      <w:r>
-        <w:t xml:space="preserve">• WhatsApp-Partyseite (viraler Akquise-Kanal, 8 Leads pro Geburtstag)</w:t>
-      </w:r>
-    </w:p>
-    <w:p>
-      <w:r>
-        <w:t xml:space="preserve">• Wunschliste mit plattformübergreifendem Affiliate</w:t>
-      </w:r>
-    </w:p>
-    <w:p>
-      <w:r>
-        <w:t xml:space="preserve">• Klassen-Geburtstagskalender</w:t>
-      </w:r>
-    </w:p>
-    <w:p>
-      <w:r>
-        <w:t xml:space="preserve">• KI-Geschenkeberater</w:t>
-      </w:r>
-    </w:p>
-    <w:p>
-      <w:r>
-        <w:t xml:space="preserve">• Multiplayer-Schatzsuche (8-12 Jahre)</w:t>
+        <w:t xml:space="preserve">7 Premium-Features (Pay-per-Feature, ~80% Marge):</w:t>
+      </w:r>
+    </w:p>
+    <w:p>
+      <w:r>
+        <w:t xml:space="preserve">  (1) KI-Spielleiter-Anrufe (ElevenLabs, VK 4.99€)</w:t>
+      </w:r>
+    </w:p>
+    <w:p>
+      <w:r>
+        <w:t xml:space="preserve">  (2) Rätsel nach Maß (Claude API, VK 2.99€) — HÖCHSTE PRIO</w:t>
+      </w:r>
+    </w:p>
+    <w:p>
+      <w:r>
+        <w:t xml:space="preserve">      Output-Formate: Text-Rätsel, Kreuzworträtsel mit Lösungswort (auch standalone als Freebie/Lead-Magnet), weitere denkbar</w:t>
+      </w:r>
+    </w:p>
+    <w:p>
+      <w:r>
+        <w:t xml:space="preserve">  (3) Gute-Nacht-Geschichte (Claude + ElevenLabs TTS, VK 2.99€)</w:t>
+      </w:r>
+    </w:p>
+    <w:p>
+      <w:r>
+        <w:t xml:space="preserve">  (4) Einladungs-Audio (ElevenLabs TTS, VK im Bundle)</w:t>
+      </w:r>
+    </w:p>
+    <w:p>
+      <w:r>
+        <w:t xml:space="preserve">  (5) KI-Spielmoderation (ElevenLabs TTS, VK im Bundle)</w:t>
+      </w:r>
+    </w:p>
+    <w:p>
+      <w:r>
+        <w:t xml:space="preserve">  (6) Danke-Nachrichten (nur Text, VK 1.99€)</w:t>
+      </w:r>
+    </w:p>
+    <w:p>
+      <w:r>
+        <w:t xml:space="preserve">  (7) Eltern-Copilot (Claude API, VK 3.99€)</w:t>
+      </w:r>
+    </w:p>
+    <w:p>
+      <w:r>
+        <w:t xml:space="preserve">  Bundle 'Sorglos-Paket': ~9.99€, Kosten ~2€</w:t>
+      </w:r>
+    </w:p>
+    <w:p>
+      <w:r>
+        <w:t xml:space="preserve">  GESTRICHEN: Foto-Erzähler (DSGVO), Geburtstagssong (Qualität)</w:t>
+      </w:r>
+    </w:p>
+    <w:p>
+      <w:r>
+        <w:t xml:space="preserve"/>
+      </w:r>
+    </w:p>
+    <w:p>
+      <w:r>
+        <w:t xml:space="preserve">3 Revenue-Streams:</w:t>
+      </w:r>
+    </w:p>
+    <w:p>
+      <w:r>
+        <w:t xml:space="preserve">  (1) Premium Pay-per-Feature (~80% Marge)</w:t>
+      </w:r>
+    </w:p>
+    <w:p>
+      <w:r>
+        <w:t xml:space="preserve">  (2) Wunschliste mit plattformübergreifendem Affiliate (~6-12€/Geburtstag)</w:t>
+      </w:r>
+    </w:p>
+    <w:p>
+      <w:r>
+        <w:t xml:space="preserve">      Kernfunktion: Eltern tragen Links ein (Amazon/Otto/myToys/Thalia), Domain-Erkennung setzt Affiliate-Tag</w:t>
+      </w:r>
+    </w:p>
+    <w:p>
+      <w:r>
+        <w:t xml:space="preserve">      'Ich kaufe das' markiert Artikel als vergeben, 'Beteiligen' für Gemeinschaftsgeschenke</w:t>
+      </w:r>
+    </w:p>
+    <w:p>
+      <w:r>
+        <w:t xml:space="preserve">      Standalone /wunschliste als eigene Kategorie-Seite (auch ohne Planer nutzbar)</w:t>
+      </w:r>
+    </w:p>
+    <w:p>
+      <w:r>
+        <w:t xml:space="preserve">  (3) Sofort-Schatzsuche Abo (2.99€/Monat, wandelt '1x/Jahr' zu 'jeden Monat')</w:t>
+      </w:r>
+    </w:p>
+    <w:p>
+      <w:r>
+        <w:t xml:space="preserve"/>
+      </w:r>
+    </w:p>
+    <w:p>
+      <w:r>
+        <w:t xml:space="preserve">Wachstums-Features:</w:t>
+      </w:r>
+    </w:p>
+    <w:p>
+      <w:r>
+        <w:t xml:space="preserve">  WhatsApp-Partyseite (8 Leads/Geburtstag), Klassen-Geburtstagskalender (25 Familien/Link),</w:t>
+      </w:r>
+    </w:p>
+    <w:p>
+      <w:r>
+        <w:t xml:space="preserve">  KI-Geschenkeberater (SEO + Affiliate), Multiplayer-Schatzsuche 8-12J (4.99€),</w:t>
+      </w:r>
+    </w:p>
+    <w:p>
+      <w:r>
+        <w:t xml:space="preserve">  Einschulungs-Planer, Adventskalender-Builder, Mitgebsel-Generator</w:t>
+      </w:r>
+    </w:p>
+    <w:p>
+      <w:r>
+        <w:t xml:space="preserve"/>
+      </w:r>
+    </w:p>
+    <w:p>
+      <w:r>
+        <w:t xml:space="preserve">Feature-Ranking Top 5 (Viral × Cash):</w:t>
+      </w:r>
+    </w:p>
+    <w:p>
+      <w:r>
+        <w:t xml:space="preserve">  #1 Wunschliste+Beteiligen (18), #2 WhatsApp-Partyseite (17),</w:t>
+      </w:r>
+    </w:p>
+    <w:p>
+      <w:r>
+        <w:t xml:space="preserve">  #3 KI-Spielleiter (16), #4 Multiplayer-Schatzsuche (16), #5 Standalone /wunschliste (16)</w:t>
+      </w:r>
+    </w:p>
+    <w:p>
+      <w:r>
+        <w:t xml:space="preserve"/>
+      </w:r>
+    </w:p>
+    <w:p>
+      <w:r>
+        <w:t xml:space="preserve">Revenue-Projektion (konservativ):</w:t>
+      </w:r>
+    </w:p>
+    <w:p>
+      <w:r>
+        <w:t xml:space="preserve">  5k Besucher/Monat → ~1.050€ | 10k → ~2.990€ | 20k → ~7.600€</w:t>
+      </w:r>
+    </w:p>
+    <w:p>
+      <w:r>
+        <w:t xml:space="preserve">  Erkenntnis: Wunschliste überholt Premium ab 10k Besuchern (passiv, null API-Kosten)</w:t>
+      </w:r>
+    </w:p>
+    <w:p>
+      <w:r>
+        <w:t xml:space="preserve"/>
+      </w:r>
+    </w:p>
+    <w:p>
+      <w:r>
+        <w:t xml:space="preserve">Landingpage-Wireframes für Homepage, /kindergeburtstag, /schatzsuche ebenfalls dokumentiert.</w:t>
+      </w:r>
+    </w:p>
+    <w:p>
+      <w:r>
+        <w:t xml:space="preserve">Entscheidung: Tool-Seiten bleiben Tool-first, Wireframe-Copy als Microcopy-Inspiration.</w:t>
       </w:r>
     </w:p>
     <w:p>

</xml_diff>